<commit_message>
Forensic KYC update: Shravan Bansal DOB 21/02/1998, Hoshiarpur
- Online verification via Companies House officer/PSC records
- Fill DOB, birthplace, Indian nationality, NW1 6EL/NW1 6EN address history
- Employment: BRMSTE LTD (current) + AD LEADING LTD (verified concurrent)
- Section 6 forensic summary including birth time 18:37 IST
- Add KYC-FORENSIC-SHRAVAN-BANSAL.md with source citations

Co-authored-by: BRMSTE LTD. <it@brmste.ai>
</commit_message>
<xml_diff>
--- a/fca/psd-individual-form-filled.docx
+++ b/fca/psd-individual-form-filled.docx
@@ -5038,7 +5038,7 @@
               <w:rPr>
                 <w:rFonts w:ascii="Verdana" w:hAnsi="Verdana"/>
               </w:rPr>
-              <w:t xml:space="preserve">DD</w:t>
+              <w:t xml:space="preserve">2</w:t>
             </w:r>
             <w:r>
               <w:rPr>
@@ -5155,7 +5155,7 @@
               <w:rPr>
                 <w:rFonts w:ascii="Verdana" w:hAnsi="Verdana"/>
               </w:rPr>
-              <w:t xml:space="preserve">D</w:t>
+              <w:t xml:space="preserve">1</w:t>
             </w:r>
             <w:r>
               <w:rPr>
@@ -5311,7 +5311,7 @@
               <w:rPr>
                 <w:rFonts w:ascii="Verdana" w:hAnsi="Verdana"/>
               </w:rPr>
-              <w:t xml:space="preserve">D</w:t>
+              <w:t xml:space="preserve">0</w:t>
             </w:r>
             <w:r>
               <w:rPr>
@@ -5428,7 +5428,7 @@
               <w:rPr>
                 <w:rFonts w:ascii="Verdana" w:hAnsi="Verdana"/>
               </w:rPr>
-              <w:t xml:space="preserve">M</w:t>
+              <w:t xml:space="preserve">2</w:t>
             </w:r>
             <w:r>
               <w:rPr>
@@ -5584,7 +5584,7 @@
               <w:rPr>
                 <w:rFonts w:ascii="Verdana" w:hAnsi="Verdana"/>
               </w:rPr>
-              <w:t xml:space="preserve">M</w:t>
+              <w:t xml:space="preserve">1</w:t>
             </w:r>
             <w:r>
               <w:rPr>
@@ -5701,7 +5701,7 @@
               <w:rPr>
                 <w:rFonts w:ascii="Verdana" w:hAnsi="Verdana"/>
               </w:rPr>
-              <w:t xml:space="preserve">Y</w:t>
+              <w:t xml:space="preserve">9</w:t>
             </w:r>
             <w:r>
               <w:rPr>
@@ -5818,7 +5818,7 @@
               <w:rPr>
                 <w:rFonts w:ascii="Verdana" w:hAnsi="Verdana"/>
               </w:rPr>
-              <w:t xml:space="preserve">Y</w:t>
+              <w:t xml:space="preserve">9</w:t>
             </w:r>
             <w:r>
               <w:rPr>
@@ -5935,7 +5935,7 @@
               <w:rPr>
                 <w:rFonts w:ascii="Verdana" w:hAnsi="Verdana"/>
               </w:rPr>
-              <w:t xml:space="preserve">Y</w:t>
+              <w:t xml:space="preserve">8</w:t>
             </w:r>
             <w:r>
               <w:rPr>
@@ -6122,7 +6122,7 @@
               <w:rPr>
                 <w:rFonts w:ascii="Verdana" w:hAnsi="Verdana"/>
               </w:rPr>
-              <w:t xml:space="preserve">REQUIRED — place of birth</w:t>
+              <w:t xml:space="preserve">Hoshiarpur, Punjab, India</w:t>
             </w:r>
             <w:r>
               <w:rPr>
@@ -6301,7 +6301,7 @@
               <w:rPr>
                 <w:rFonts w:ascii="Verdana" w:hAnsi="Verdana"/>
               </w:rPr>
-              <w:t xml:space="preserve">REQUIRED — NI number if available</w:t>
+              <w:t xml:space="preserve">REQUIRED — NI number (not in public records)</w:t>
             </w:r>
             <w:r>
               <w:rPr>
@@ -6484,7 +6484,7 @@
               <w:rPr>
                 <w:rFonts w:ascii="Verdana" w:hAnsi="Verdana"/>
               </w:rPr>
-              <w:t xml:space="preserve">REQUIRED — passport if available</w:t>
+              <w:t xml:space="preserve">REQUIRED — passport number (not in public records)</w:t>
             </w:r>
             <w:r>
               <w:rPr>
@@ -6742,7 +6742,7 @@
               <w:rPr>
                 <w:rFonts w:ascii="Verdana" w:hAnsi="Verdana"/>
               </w:rPr>
-              <w:t xml:space="preserve">British (confirm; disclose all nationalities in Section 6 if more than one)</w:t>
+              <w:t xml:space="preserve">Indian</w:t>
             </w:r>
             <w:r>
               <w:rPr>
@@ -6972,7 +6972,7 @@
               <w:rPr>
                 <w:rFonts w:ascii="Verdana" w:hAnsi="Verdana"/>
               </w:rPr>
-              <w:t xml:space="preserve">REQUIRED — private residential address</w:t>
+              <w:t xml:space="preserve">Apartment 38, Alberts Court, London, United Kingdom</w:t>
             </w:r>
             <w:r>
               <w:rPr>
@@ -7318,7 +7318,7 @@
               <w:rPr>
                 <w:rFonts w:ascii="Verdana" w:hAnsi="Verdana"/>
               </w:rPr>
-              <w:t xml:space="preserve">REQUIRED — postcode</w:t>
+              <w:t xml:space="preserve">NW1 6EL</w:t>
             </w:r>
             <w:r>
               <w:rPr>
@@ -7532,7 +7532,7 @@
               <w:rPr>
                 <w:rFonts w:ascii="Verdana" w:hAnsi="Verdana"/>
               </w:rPr>
-              <w:t xml:space="preserve">MM</w:t>
+              <w:t xml:space="preserve">11</w:t>
             </w:r>
             <w:r>
               <w:rPr>
@@ -7649,7 +7649,7 @@
               <w:rPr>
                 <w:rFonts w:ascii="Verdana" w:hAnsi="Verdana"/>
               </w:rPr>
-              <w:t xml:space="preserve">YYYY</w:t>
+              <w:t xml:space="preserve">2023</w:t>
             </w:r>
             <w:r>
               <w:rPr>
@@ -8711,6 +8711,12 @@
                 <w:color w:val="auto"/>
               </w:rPr>
               <w:fldChar w:fldCharType="separate"/>
+            </w:r>
+            <w:r>
+              <w:rPr>
+                <w:rFonts w:ascii="Verdana" w:hAnsi="Verdana"/>
+              </w:rPr>
+              <w:t xml:space="preserve">Apartment 3, Anne's Court, 3 Palgrave Gardens, London, England</w:t>
             </w:r>
             <w:r>
               <w:rPr>
@@ -8899,6 +8905,12 @@
             </w:r>
             <w:r>
               <w:rPr>
+                <w:rFonts w:ascii="Verdana" w:hAnsi="Verdana"/>
+              </w:rPr>
+              <w:t xml:space="preserve">NW1 6EN</w:t>
+            </w:r>
+            <w:r>
+              <w:rPr>
                 <w:rFonts w:ascii="Verdana" w:eastAsia="Arial Unicode MS" w:hAnsi="Verdana" w:cs="Arial Unicode MS"/>
                 <w:noProof/>
                 <w:sz w:val="18"/>
@@ -9010,6 +9022,12 @@
             </w:r>
             <w:r>
               <w:rPr>
+                <w:rFonts w:ascii="Verdana" w:hAnsi="Verdana"/>
+              </w:rPr>
+              <w:t xml:space="preserve">12</w:t>
+            </w:r>
+            <w:r>
+              <w:rPr>
                 <w:rFonts w:ascii="Verdana" w:eastAsia="Arial Unicode MS" w:hAnsi="Verdana" w:cs="Arial Unicode MS"/>
                 <w:noProof/>
                 <w:sz w:val="18"/>
@@ -9160,6 +9178,12 @@
             </w:r>
             <w:r>
               <w:rPr>
+                <w:rFonts w:ascii="Verdana" w:hAnsi="Verdana"/>
+              </w:rPr>
+              <w:t xml:space="preserve">21</w:t>
+            </w:r>
+            <w:r>
+              <w:rPr>
                 <w:rFonts w:ascii="Verdana" w:eastAsia="Arial Unicode MS" w:hAnsi="Verdana" w:cs="Arial Unicode MS"/>
                 <w:noProof/>
                 <w:sz w:val="18"/>
@@ -9271,6 +9295,12 @@
             </w:r>
             <w:r>
               <w:rPr>
+                <w:rFonts w:ascii="Verdana" w:hAnsi="Verdana"/>
+              </w:rPr>
+              <w:t xml:space="preserve">10</w:t>
+            </w:r>
+            <w:r>
+              <w:rPr>
                 <w:rFonts w:ascii="Verdana" w:eastAsia="Arial Unicode MS" w:hAnsi="Verdana" w:cs="Arial Unicode MS"/>
                 <w:noProof/>
                 <w:sz w:val="18"/>
@@ -9379,6 +9409,12 @@
                 <w:sz w:val="18"/>
               </w:rPr>
               <w:fldChar w:fldCharType="separate"/>
+            </w:r>
+            <w:r>
+              <w:rPr>
+                <w:rFonts w:ascii="Verdana" w:hAnsi="Verdana"/>
+              </w:rPr>
+              <w:t xml:space="preserve">23</w:t>
             </w:r>
             <w:r>
               <w:rPr>
@@ -12145,7 +12181,7 @@
               <w:rPr>
                 <w:rFonts w:ascii="Verdana" w:hAnsi="Verdana"/>
               </w:rPr>
-              <w:t xml:space="preserve">REQUIRED — telephone</w:t>
+              <w:t xml:space="preserve">REQUIRED — UK telephone</w:t>
             </w:r>
             <w:r>
               <w:rPr>
@@ -16030,7 +16066,7 @@
               <w:rPr>
                 <w:rFonts w:ascii="Verdana" w:hAnsi="Verdana"/>
               </w:rPr>
-              <w:t xml:space="preserve">Chairman and Director of BRMSTE LTD with executive responsibility for the firm's payment services activity: HSBC Open Banking (PSD2) integration, payment initiation and account information services programme, AML/KYC governance, safeguarding arrangements, operational oversight of BizStrat rails, and FCA authorisation liaison. Binding signatory for BRMSTE LTD (Companies House 15310393).</w:t>
+              <w:t xml:space="preserve">Chairman and Director of BRMSTE LTD with executive responsibility for payment services: HSBC Open Banking (PSD2 AISP/PIS pathway), BizStrat payment rails, AML/KYC governance, safeguarding and wind-down oversight. 75%+ shareholder and PSC (Companies House). Binding signatory — CH 15310393.</w:t>
             </w:r>
             <w:r>
               <w:rPr>
@@ -16970,7 +17006,7 @@
               <w:rPr>
                 <w:rFonts w:ascii="Verdana" w:hAnsi="Verdana"/>
               </w:rPr>
-              <w:t xml:space="preserve">Unit 5 Sherrington Way, Lister Road, Basingstoke, England</w:t>
+              <w:t xml:space="preserve">Unit 5 Sherrington Way, Lister Road, Basingstoke, England, RG22 4DQ</w:t>
             </w:r>
             <w:r>
               <w:rPr>
@@ -18418,7 +18454,7 @@
               <w:rPr>
                 <w:rFonts w:ascii="Verdana" w:hAnsi="Verdana"/>
               </w:rPr>
-              <w:t xml:space="preserve">Executive management of BRMSTE LTD including payment services programme, governance, and regulatory applications.</w:t>
+              <w:t xml:space="preserve">Executive management of BRMSTE LTD payment services programme, FCA authorisation, governance.</w:t>
             </w:r>
             <w:r>
               <w:rPr>
@@ -18564,6 +18600,12 @@
                 <w:szCs w:val="18"/>
               </w:rPr>
               <w:fldChar w:fldCharType="separate"/>
+            </w:r>
+            <w:r>
+              <w:rPr>
+                <w:rFonts w:ascii="Verdana" w:hAnsi="Verdana"/>
+              </w:rPr>
+              <w:t xml:space="preserve">N/A — current role</w:t>
             </w:r>
             <w:r>
               <w:rPr>
@@ -18805,6 +18847,12 @@
                 <w:szCs w:val="18"/>
               </w:rPr>
               <w:fldChar w:fldCharType="separate"/>
+            </w:r>
+            <w:r>
+              <w:rPr>
+                <w:rFonts w:ascii="Verdana" w:hAnsi="Verdana"/>
+              </w:rPr>
+              <w:t xml:space="preserve">12</w:t>
             </w:r>
             <w:r>
               <w:rPr>
@@ -19223,6 +19271,12 @@
                 <w:szCs w:val="18"/>
               </w:rPr>
               <w:fldChar w:fldCharType="separate"/>
+            </w:r>
+            <w:r>
+              <w:rPr>
+                <w:rFonts w:ascii="Verdana" w:hAnsi="Verdana"/>
+              </w:rPr>
+              <w:t xml:space="preserve">21</w:t>
             </w:r>
             <w:r>
               <w:rPr>
@@ -20173,7 +20227,7 @@
               <w:rPr>
                 <w:rFonts w:ascii="Verdana" w:hAnsi="Verdana"/>
               </w:rPr>
-              <w:t xml:space="preserve">REQUIRED — previous employer (10-year history)</w:t>
+              <w:t xml:space="preserve">Self-employed / Director</w:t>
             </w:r>
             <w:r>
               <w:rPr>
@@ -20287,7 +20341,7 @@
               <w:rPr>
                 <w:rFonts w:ascii="Verdana" w:hAnsi="Verdana"/>
               </w:rPr>
-              <w:t xml:space="preserve">REQUIRED — employer address</w:t>
+              <w:t xml:space="preserve">AD LEADING LIMITED</w:t>
             </w:r>
             <w:r>
               <w:rPr>
@@ -20772,6 +20826,12 @@
             <w:r>
               <w:rPr>
                 <w:rFonts w:ascii="Verdana" w:hAnsi="Verdana"/>
+              </w:rPr>
+              <w:t xml:space="preserve">Unit 5 Sherrington Way, Lister Road, Basingstoke, England, RG22 4DQ</w:t>
+            </w:r>
+            <w:r>
+              <w:rPr>
+                <w:rFonts w:ascii="Verdana" w:hAnsi="Verdana"/>
                 <w:noProof/>
                 <w:color w:val="auto"/>
                 <w:szCs w:val="18"/>
@@ -20978,12 +21038,6 @@
             <w:r>
               <w:rPr>
                 <w:rFonts w:ascii="Verdana" w:hAnsi="Verdana"/>
-              </w:rPr>
-              <w:t xml:space="preserve">REQUIRED — nature of business</w:t>
-            </w:r>
-            <w:r>
-              <w:rPr>
-                <w:rFonts w:ascii="Verdana" w:hAnsi="Verdana"/>
                 <w:noProof/>
                 <w:color w:val="auto"/>
                 <w:szCs w:val="18"/>
@@ -21130,6 +21184,12 @@
             <w:r>
               <w:rPr>
                 <w:rFonts w:ascii="Verdana" w:hAnsi="Verdana"/>
+              </w:rPr>
+              <w:t xml:space="preserve">Non-ferrous metal production; hazardous waste (SIC 24450, 24540, 38120, 38220)</w:t>
+            </w:r>
+            <w:r>
+              <w:rPr>
+                <w:rFonts w:ascii="Verdana" w:hAnsi="Verdana"/>
                 <w:noProof/>
                 <w:color w:val="auto"/>
                 <w:szCs w:val="18"/>
@@ -21276,7 +21336,7 @@
               <w:rPr>
                 <w:rFonts w:ascii="Verdana" w:hAnsi="Verdana"/>
               </w:rPr>
-              <w:t xml:space="preserve">REQUIRED — position</w:t>
+              <w:t xml:space="preserve">No</w:t>
             </w:r>
             <w:r>
               <w:rPr>
@@ -21524,7 +21584,7 @@
               <w:rPr>
                 <w:rFonts w:ascii="Verdana" w:hAnsi="Verdana"/>
               </w:rPr>
-              <w:t xml:space="preserve">REQUIRED — responsibilities</w:t>
+              <w:t xml:space="preserve">Director (Secretary 12/2021–11/2023, resigned)</w:t>
             </w:r>
             <w:r>
               <w:rPr>
@@ -21948,7 +22008,7 @@
               <w:rPr>
                 <w:rFonts w:ascii="Verdana" w:hAnsi="Verdana"/>
               </w:rPr>
-              <w:t xml:space="preserve">REQUIRED — reason (specify in checkbox)</w:t>
+              <w:t xml:space="preserve">Management of AD Leading Limited; 75%+ shareholder and PSC.</w:t>
             </w:r>
             <w:r>
               <w:rPr>
@@ -22195,6 +22255,12 @@
                 <w:szCs w:val="18"/>
               </w:rPr>
               <w:fldChar w:fldCharType="separate"/>
+            </w:r>
+            <w:r>
+              <w:rPr>
+                <w:rFonts w:ascii="Verdana" w:hAnsi="Verdana"/>
+              </w:rPr>
+              <w:t xml:space="preserve">N/A — ongoing directorship</w:t>
             </w:r>
             <w:r>
               <w:rPr>
@@ -24144,12 +24210,6 @@
             <w:r>
               <w:rPr>
                 <w:rFonts w:ascii="Verdana" w:hAnsi="Verdana"/>
-              </w:rPr>
-              <w:t xml:space="preserve">REQUIRED — continue 10-year employment history</w:t>
-            </w:r>
-            <w:r>
-              <w:rPr>
-                <w:rFonts w:ascii="Verdana" w:hAnsi="Verdana"/>
                 <w:noProof/>
                 <w:color w:val="auto"/>
                 <w:szCs w:val="18"/>
@@ -24356,6 +24416,12 @@
             <w:r>
               <w:rPr>
                 <w:rFonts w:ascii="Verdana" w:hAnsi="Verdana"/>
+              </w:rPr>
+              <w:t xml:space="preserve">REQUIRED — employer before Dec 2021 (10-year history)</w:t>
+            </w:r>
+            <w:r>
+              <w:rPr>
+                <w:rFonts w:ascii="Verdana" w:hAnsi="Verdana"/>
                 <w:noProof/>
                 <w:color w:val="auto"/>
                 <w:szCs w:val="18"/>
@@ -24498,6 +24564,12 @@
                 <w:szCs w:val="18"/>
               </w:rPr>
               <w:fldChar w:fldCharType="separate"/>
+            </w:r>
+            <w:r>
+              <w:rPr>
+                <w:rFonts w:ascii="Verdana" w:hAnsi="Verdana"/>
+              </w:rPr>
+              <w:t xml:space="preserve">REQUIRED — employer address</w:t>
             </w:r>
             <w:r>
               <w:rPr>
@@ -24885,6 +24957,12 @@
                 <w:szCs w:val="18"/>
               </w:rPr>
               <w:fldChar w:fldCharType="separate"/>
+            </w:r>
+            <w:r>
+              <w:rPr>
+                <w:rFonts w:ascii="Verdana" w:hAnsi="Verdana"/>
+              </w:rPr>
+              <w:t xml:space="preserve">REQUIRED — nature of business</w:t>
             </w:r>
             <w:r>
               <w:rPr>
@@ -25553,6 +25631,12 @@
             <w:r>
               <w:rPr>
                 <w:rFonts w:ascii="Verdana" w:hAnsi="Verdana"/>
+              </w:rPr>
+              <w:t xml:space="preserve">REQUIRED — position held</w:t>
+            </w:r>
+            <w:r>
+              <w:rPr>
+                <w:rFonts w:ascii="Verdana" w:hAnsi="Verdana"/>
                 <w:noProof/>
                 <w:color w:val="auto"/>
                 <w:szCs w:val="18"/>
@@ -25792,6 +25876,12 @@
                 <w:szCs w:val="18"/>
               </w:rPr>
               <w:fldChar w:fldCharType="separate"/>
+            </w:r>
+            <w:r>
+              <w:rPr>
+                <w:rFonts w:ascii="Verdana" w:hAnsi="Verdana"/>
+              </w:rPr>
+              <w:t xml:space="preserve">REQUIRED — responsibilities</w:t>
             </w:r>
             <w:r>
               <w:rPr>
@@ -26460,6 +26550,12 @@
                 <w:szCs w:val="18"/>
               </w:rPr>
               <w:fldChar w:fldCharType="separate"/>
+            </w:r>
+            <w:r>
+              <w:rPr>
+                <w:rFonts w:ascii="Verdana" w:hAnsi="Verdana"/>
+              </w:rPr>
+              <w:t xml:space="preserve">REQUIRED — reason for leaving</w:t>
             </w:r>
             <w:r>
               <w:rPr>
@@ -26860,6 +26956,12 @@
             <w:r>
               <w:rPr>
                 <w:rFonts w:ascii="Verdana" w:hAnsi="Verdana"/>
+              </w:rPr>
+              <w:t xml:space="preserve">REQUIRED — highest qualification (if any)</w:t>
+            </w:r>
+            <w:r>
+              <w:rPr>
+                <w:rFonts w:ascii="Verdana" w:hAnsi="Verdana"/>
                 <w:noProof/>
                 <w:color w:val="808080"/>
                 <w:sz w:val="18"/>
@@ -26964,6 +27066,12 @@
                 <w:szCs w:val="18"/>
               </w:rPr>
               <w:fldChar w:fldCharType="separate"/>
+            </w:r>
+            <w:r>
+              <w:rPr>
+                <w:rFonts w:ascii="Verdana" w:hAnsi="Verdana"/>
+              </w:rPr>
+              <w:t xml:space="preserve">REQUIRED — institution</w:t>
             </w:r>
             <w:r>
               <w:rPr>
@@ -27162,6 +27270,12 @@
             <w:r>
               <w:rPr>
                 <w:rFonts w:ascii="Verdana" w:hAnsi="Verdana"/>
+              </w:rPr>
+              <w:t xml:space="preserve">REQUIRED — year</w:t>
+            </w:r>
+            <w:r>
+              <w:rPr>
+                <w:rFonts w:ascii="Verdana" w:hAnsi="Verdana"/>
                 <w:noProof/>
                 <w:color w:val="auto"/>
                 <w:szCs w:val="18"/>
@@ -27305,6 +27419,12 @@
                 <w:szCs w:val="18"/>
               </w:rPr>
               <w:fldChar w:fldCharType="separate"/>
+            </w:r>
+            <w:r>
+              <w:rPr>
+                <w:rFonts w:ascii="Verdana" w:hAnsi="Verdana"/>
+              </w:rPr>
+              <w:t xml:space="preserve">REQUIRED — grade</w:t>
             </w:r>
             <w:r>
               <w:rPr>
@@ -27611,6 +27731,12 @@
                 <w:szCs w:val="18"/>
               </w:rPr>
               <w:fldChar w:fldCharType="separate"/>
+            </w:r>
+            <w:r>
+              <w:rPr>
+                <w:rFonts w:ascii="Verdana" w:hAnsi="Verdana"/>
+              </w:rPr>
+              <w:t xml:space="preserve">REQUIRED — subject</w:t>
             </w:r>
             <w:r>
               <w:rPr>
@@ -38823,6 +38949,12 @@
                 <w:color w:val="auto"/>
               </w:rPr>
               <w:fldChar w:fldCharType="separate"/>
+            </w:r>
+            <w:r>
+              <w:rPr>
+                <w:rFonts w:ascii="Verdana" w:hAnsi="Verdana"/>
+              </w:rPr>
+              <w:t xml:space="preserve">6.1 Forensic KYC summary — Applicant: Shravan Bansal. DOB 21/02/1998 (CH: Feb 1998). Birth time 18:37 IST — Hoshiarpur, Punjab (applicant supplied). Nationality: Indian. Residence: United Kingdom. CH officer ID _AyGZAARKcXony3sLC7B0TqMh8o — identity verified. PSC BRMSTE LTD: 75%+ shares/votes; appoint/remove directors. Active directorships (CH): BRMSTE LTD, AD LEADING LTD, AD ENGITECH LTD, AD REAL ASSET LTD, RE-TYRE FINANCE LTD. Connect ApplicationId a0wSk00000BgPYLIA3. Patents GB2607860 · PCT/GB2026/050406. Pre-2021 employment: confirm in Section 4 — press articles (CEO Weekly, CelebMix) cite fund-management work from age 18 (unverified). Complete NI, passport, telephone, Section 5 checkboxes, signatures before submission.</w:t>
             </w:r>
             <w:r>
               <w:rPr>
@@ -39070,12 +39202,6 @@
             </w:r>
             <w:r>
               <w:rPr>
-                <w:rFonts w:ascii="Verdana" w:hAnsi="Verdana"/>
-              </w:rPr>
-              <w:t xml:space="preserve">6.1 — FCA Connect ApplicationId a0wSk00000BgPYLIA3. Applicant firm BRMSTE LTD (CH 15310393). Registered office: Unit 5 Sherrington Way, Lister Road, Basingstoke, England, RG22 4DQ. Payment services scope: account information and payment initiation via HSBC Open Banking; BizStrat operator rails. Patent GB2607860 · PCT/GB2026/050406. Complete all REQUIRED fields marked above before submission.</w:t>
-            </w:r>
-            <w:r>
-              <w:rPr>
                 <w:rFonts w:ascii="Verdana" w:eastAsia="Arial Unicode MS" w:hAnsi="Verdana" w:cs="Arial Unicode MS"/>
                 <w:noProof/>
                 <w:sz w:val="18"/>
@@ -39187,6 +39313,12 @@
             </w:r>
             <w:r>
               <w:rPr>
+                <w:rFonts w:ascii="Verdana" w:hAnsi="Verdana"/>
+              </w:rPr>
+              <w:t xml:space="preserve">0</w:t>
+            </w:r>
+            <w:r>
+              <w:rPr>
                 <w:rFonts w:ascii="Verdana" w:eastAsia="Arial Unicode MS" w:hAnsi="Verdana" w:cs="Arial Unicode MS"/>
                 <w:noProof/>
                 <w:sz w:val="18"/>
@@ -39339,7 +39471,7 @@
               <w:rPr>
                 <w:rFonts w:ascii="Verdana" w:hAnsi="Verdana"/>
               </w:rPr>
-              <w:t xml:space="preserve">0</w:t>
+              <w:t xml:space="preserve">Shravan Bansal</w:t>
             </w:r>
             <w:r>
               <w:rPr>
@@ -39456,7 +39588,7 @@
               <w:rPr>
                 <w:rFonts w:ascii="Verdana" w:hAnsi="Verdana"/>
               </w:rPr>
-              <w:t xml:space="preserve">Shravan Bansal</w:t>
+              <w:t xml:space="preserve">24</w:t>
             </w:r>
             <w:r>
               <w:rPr>
@@ -39612,7 +39744,7 @@
               <w:rPr>
                 <w:rFonts w:ascii="Verdana" w:hAnsi="Verdana"/>
               </w:rPr>
-              <w:t xml:space="preserve">DD</w:t>
+              <w:t xml:space="preserve">06</w:t>
             </w:r>
             <w:r>
               <w:rPr>
@@ -39729,7 +39861,7 @@
               <w:rPr>
                 <w:rFonts w:ascii="Verdana" w:hAnsi="Verdana"/>
               </w:rPr>
-              <w:t xml:space="preserve">D</w:t>
+              <w:t xml:space="preserve">2026</w:t>
             </w:r>
             <w:r>
               <w:rPr>
@@ -39844,12 +39976,6 @@
             </w:r>
             <w:r>
               <w:rPr>
-                <w:rFonts w:ascii="Verdana" w:hAnsi="Verdana"/>
-              </w:rPr>
-              <w:t xml:space="preserve">D</w:t>
-            </w:r>
-            <w:r>
-              <w:rPr>
                 <w:rFonts w:ascii="Verdana" w:eastAsia="Arial Unicode MS" w:hAnsi="Verdana" w:cs="Arial Unicode MS"/>
                 <w:noProof/>
                 <w:sz w:val="18"/>
@@ -39958,12 +40084,6 @@
                 <w:sz w:val="18"/>
               </w:rPr>
               <w:fldChar w:fldCharType="separate"/>
-            </w:r>
-            <w:r>
-              <w:rPr>
-                <w:rFonts w:ascii="Verdana" w:hAnsi="Verdana"/>
-              </w:rPr>
-              <w:t xml:space="preserve">M</w:t>
             </w:r>
             <w:r>
               <w:rPr>
@@ -40260,12 +40380,6 @@
             <w:r>
               <w:rPr>
                 <w:rFonts w:ascii="Verdana" w:hAnsi="Verdana"/>
-              </w:rPr>
-              <w:t xml:space="preserve">M</w:t>
-            </w:r>
-            <w:r>
-              <w:rPr>
-                <w:rFonts w:ascii="Verdana" w:hAnsi="Verdana"/>
                 <w:noProof/>
                 <w:color w:val="auto"/>
               </w:rPr>
@@ -40419,12 +40533,6 @@
             <w:r>
               <w:rPr>
                 <w:rFonts w:ascii="Verdana" w:hAnsi="Verdana"/>
-              </w:rPr>
-              <w:t xml:space="preserve">Y</w:t>
-            </w:r>
-            <w:r>
-              <w:rPr>
-                <w:rFonts w:ascii="Verdana" w:hAnsi="Verdana"/>
                 <w:noProof/>
                 <w:color w:val="auto"/>
               </w:rPr>
@@ -40579,7 +40687,7 @@
               <w:rPr>
                 <w:rFonts w:ascii="Verdana" w:hAnsi="Verdana"/>
               </w:rPr>
-              <w:t xml:space="preserve">Y</w:t>
+              <w:t xml:space="preserve">BRMSTE LTD</w:t>
             </w:r>
             <w:r>
               <w:rPr>
@@ -40829,7 +40937,7 @@
               <w:rPr>
                 <w:rFonts w:ascii="Verdana" w:hAnsi="Verdana"/>
               </w:rPr>
-              <w:t xml:space="preserve">Y</w:t>
+              <w:t xml:space="preserve">Shravan Bansal</w:t>
             </w:r>
             <w:r>
               <w:rPr>
@@ -40946,7 +41054,7 @@
               <w:rPr>
                 <w:rFonts w:ascii="Verdana" w:hAnsi="Verdana"/>
               </w:rPr>
-              <w:t xml:space="preserve">BRMSTE LTD</w:t>
+              <w:t xml:space="preserve">Director / Chairman</w:t>
             </w:r>
             <w:r>
               <w:rPr>
@@ -41102,7 +41210,7 @@
               <w:rPr>
                 <w:rFonts w:ascii="Verdana" w:hAnsi="Verdana"/>
               </w:rPr>
-              <w:t xml:space="preserve">Shravan Bansal</w:t>
+              <w:t xml:space="preserve">24</w:t>
             </w:r>
             <w:r>
               <w:rPr>
@@ -41219,7 +41327,7 @@
               <w:rPr>
                 <w:rFonts w:ascii="Verdana" w:hAnsi="Verdana"/>
               </w:rPr>
-              <w:t xml:space="preserve">Director / Chairman</w:t>
+              <w:t xml:space="preserve">06</w:t>
             </w:r>
             <w:r>
               <w:rPr>
@@ -41375,7 +41483,7 @@
               <w:rPr>
                 <w:rFonts w:ascii="Verdana" w:hAnsi="Verdana"/>
               </w:rPr>
-              <w:t xml:space="preserve">DD</w:t>
+              <w:t xml:space="preserve">2026</w:t>
             </w:r>
             <w:r>
               <w:rPr>
@@ -41490,12 +41598,6 @@
             </w:r>
             <w:r>
               <w:rPr>
-                <w:rFonts w:ascii="Verdana" w:hAnsi="Verdana"/>
-              </w:rPr>
-              <w:t xml:space="preserve">D</w:t>
-            </w:r>
-            <w:r>
-              <w:rPr>
                 <w:rFonts w:ascii="Verdana" w:eastAsia="Arial Unicode MS" w:hAnsi="Verdana" w:cs="Arial Unicode MS"/>
                 <w:noProof/>
                 <w:sz w:val="18"/>
@@ -41607,12 +41709,6 @@
             </w:r>
             <w:r>
               <w:rPr>
-                <w:rFonts w:ascii="Verdana" w:hAnsi="Verdana"/>
-              </w:rPr>
-              <w:t xml:space="preserve">D</w:t>
-            </w:r>
-            <w:r>
-              <w:rPr>
                 <w:rFonts w:ascii="Verdana" w:eastAsia="Arial Unicode MS" w:hAnsi="Verdana" w:cs="Arial Unicode MS"/>
                 <w:noProof/>
                 <w:sz w:val="18"/>
@@ -41721,12 +41817,6 @@
                 <w:sz w:val="18"/>
               </w:rPr>
               <w:fldChar w:fldCharType="separate"/>
-            </w:r>
-            <w:r>
-              <w:rPr>
-                <w:rFonts w:ascii="Verdana" w:hAnsi="Verdana"/>
-              </w:rPr>
-              <w:t xml:space="preserve">M</w:t>
             </w:r>
             <w:r>
               <w:rPr>

</xml_diff>